<commit_message>
update srs: bcrypt -> argon2
</commit_message>
<xml_diff>
--- a/docs/Domain_analysis.docx
+++ b/docs/Domain_analysis.docx
@@ -6975,7 +6975,7 @@
           <w:sz w:val="28"/>
           <w:szCs w:val="28"/>
         </w:rPr>
-        <w:t xml:space="preserve">Таблица 8. Сущность «Уведомление» (Notification)</w:t>
+        <w:t>Таблица 8. Сущность «Уведомление» (Notification)</w:t>
       </w:r>
     </w:p>
     <w:tbl>
@@ -6985,9 +6985,9 @@
         <w:tblLook w:val="04A0" w:firstRow="1" w:lastRow="0" w:firstColumn="1" w:lastColumn="0" w:noHBand="0" w:noVBand="1"/>
       </w:tblPr>
       <w:tblGrid>
-        <w:gridCol w:w="1296"/>
-        <w:gridCol w:w="1539"/>
-        <w:gridCol w:w="3393"/>
+        <w:gridCol w:w="1510"/>
+        <w:gridCol w:w="1856"/>
+        <w:gridCol w:w="2862"/>
         <w:gridCol w:w="3117"/>
       </w:tblGrid>
       <w:tr>
@@ -7089,67 +7089,67 @@
               <w:rPr>
                 <w:rFonts w:ascii="Times New Roman" w:hAnsi="Times New Roman" w:cs="Times New Roman"/>
               </w:rPr>
-              <w:t xml:space="preserve">id</w:t>
-            </w:r>
-          </w:p>
-        </w:tc>
-        <w:tc>
-          <w:tcPr>
-            <w:tcW w:w="0" w:type="auto"/>
-            <w:hideMark/>
-          </w:tcPr>
-          <w:p>
-            <w:pPr>
-              <w:jc w:val="center"/>
-              <w:rPr>
-                <w:rFonts w:ascii="Times New Roman" w:hAnsi="Times New Roman" w:cs="Times New Roman"/>
-              </w:rPr>
-            </w:pPr>
-            <w:r>
-              <w:rPr>
-                <w:rFonts w:ascii="Times New Roman" w:hAnsi="Times New Roman" w:cs="Times New Roman"/>
-              </w:rPr>
-              <w:t xml:space="preserve">integer</w:t>
-            </w:r>
-          </w:p>
-        </w:tc>
-        <w:tc>
-          <w:tcPr>
-            <w:tcW w:w="0" w:type="auto"/>
-            <w:hideMark/>
-          </w:tcPr>
-          <w:p>
-            <w:pPr>
-              <w:jc w:val="center"/>
-              <w:rPr>
-                <w:rFonts w:ascii="Times New Roman" w:hAnsi="Times New Roman" w:cs="Times New Roman"/>
-              </w:rPr>
-            </w:pPr>
-            <w:r>
-              <w:rPr>
-                <w:rFonts w:ascii="Times New Roman" w:hAnsi="Times New Roman" w:cs="Times New Roman"/>
-              </w:rPr>
-              <w:t xml:space="preserve">NOT NULL, PK</w:t>
-            </w:r>
-          </w:p>
-        </w:tc>
-        <w:tc>
-          <w:tcPr>
-            <w:tcW w:w="0" w:type="auto"/>
-            <w:hideMark/>
-          </w:tcPr>
-          <w:p>
-            <w:pPr>
-              <w:jc w:val="center"/>
-              <w:rPr>
-                <w:rFonts w:ascii="Times New Roman" w:hAnsi="Times New Roman" w:cs="Times New Roman"/>
-              </w:rPr>
-            </w:pPr>
-            <w:r>
-              <w:rPr>
-                <w:rFonts w:ascii="Times New Roman" w:hAnsi="Times New Roman" w:cs="Times New Roman"/>
-              </w:rPr>
-              <w:t xml:space="preserve">—</w:t>
+              <w:t>id</w:t>
+            </w:r>
+          </w:p>
+        </w:tc>
+        <w:tc>
+          <w:tcPr>
+            <w:tcW w:w="0" w:type="auto"/>
+            <w:hideMark/>
+          </w:tcPr>
+          <w:p>
+            <w:pPr>
+              <w:jc w:val="center"/>
+              <w:rPr>
+                <w:rFonts w:ascii="Times New Roman" w:hAnsi="Times New Roman" w:cs="Times New Roman"/>
+              </w:rPr>
+            </w:pPr>
+            <w:r>
+              <w:rPr>
+                <w:rFonts w:ascii="Times New Roman" w:hAnsi="Times New Roman" w:cs="Times New Roman"/>
+              </w:rPr>
+              <w:t>integer</w:t>
+            </w:r>
+          </w:p>
+        </w:tc>
+        <w:tc>
+          <w:tcPr>
+            <w:tcW w:w="0" w:type="auto"/>
+            <w:hideMark/>
+          </w:tcPr>
+          <w:p>
+            <w:pPr>
+              <w:jc w:val="center"/>
+              <w:rPr>
+                <w:rFonts w:ascii="Times New Roman" w:hAnsi="Times New Roman" w:cs="Times New Roman"/>
+              </w:rPr>
+            </w:pPr>
+            <w:r>
+              <w:rPr>
+                <w:rFonts w:ascii="Times New Roman" w:hAnsi="Times New Roman" w:cs="Times New Roman"/>
+              </w:rPr>
+              <w:t>NOT NULL, PK</w:t>
+            </w:r>
+          </w:p>
+        </w:tc>
+        <w:tc>
+          <w:tcPr>
+            <w:tcW w:w="0" w:type="auto"/>
+            <w:hideMark/>
+          </w:tcPr>
+          <w:p>
+            <w:pPr>
+              <w:jc w:val="center"/>
+              <w:rPr>
+                <w:rFonts w:ascii="Times New Roman" w:hAnsi="Times New Roman" w:cs="Times New Roman"/>
+              </w:rPr>
+            </w:pPr>
+            <w:r>
+              <w:rPr>
+                <w:rFonts w:ascii="Times New Roman" w:hAnsi="Times New Roman" w:cs="Times New Roman"/>
+              </w:rPr>
+              <w:t>—</w:t>
             </w:r>
           </w:p>
         </w:tc>
@@ -7171,67 +7171,67 @@
               <w:rPr>
                 <w:rFonts w:ascii="Times New Roman" w:hAnsi="Times New Roman" w:cs="Times New Roman"/>
               </w:rPr>
-              <w:t xml:space="preserve">type</w:t>
-            </w:r>
-          </w:p>
-        </w:tc>
-        <w:tc>
-          <w:tcPr>
-            <w:tcW w:w="0" w:type="auto"/>
-            <w:hideMark/>
-          </w:tcPr>
-          <w:p>
-            <w:pPr>
-              <w:jc w:val="center"/>
-              <w:rPr>
-                <w:rFonts w:ascii="Times New Roman" w:hAnsi="Times New Roman" w:cs="Times New Roman"/>
-              </w:rPr>
-            </w:pPr>
-            <w:r>
-              <w:rPr>
-                <w:rFonts w:ascii="Times New Roman" w:hAnsi="Times New Roman" w:cs="Times New Roman"/>
-              </w:rPr>
-              <w:t xml:space="preserve">notification_type</w:t>
-            </w:r>
-          </w:p>
-        </w:tc>
-        <w:tc>
-          <w:tcPr>
-            <w:tcW w:w="0" w:type="auto"/>
-            <w:hideMark/>
-          </w:tcPr>
-          <w:p>
-            <w:pPr>
-              <w:jc w:val="center"/>
-              <w:rPr>
-                <w:rFonts w:ascii="Times New Roman" w:hAnsi="Times New Roman" w:cs="Times New Roman"/>
-              </w:rPr>
-            </w:pPr>
-            <w:r>
-              <w:rPr>
-                <w:rFonts w:ascii="Times New Roman" w:hAnsi="Times New Roman" w:cs="Times New Roman"/>
-              </w:rPr>
-              <w:t xml:space="preserve">NOT NULL</w:t>
-            </w:r>
-          </w:p>
-        </w:tc>
-        <w:tc>
-          <w:tcPr>
-            <w:tcW w:w="0" w:type="auto"/>
-            <w:hideMark/>
-          </w:tcPr>
-          <w:p>
-            <w:pPr>
-              <w:jc w:val="center"/>
-              <w:rPr>
-                <w:rFonts w:ascii="Times New Roman" w:hAnsi="Times New Roman" w:cs="Times New Roman"/>
-              </w:rPr>
-            </w:pPr>
-            <w:r>
-              <w:rPr>
-                <w:rFonts w:ascii="Times New Roman" w:hAnsi="Times New Roman" w:cs="Times New Roman"/>
-              </w:rPr>
-              <w:t xml:space="preserve">—</w:t>
+              <w:t>type</w:t>
+            </w:r>
+          </w:p>
+        </w:tc>
+        <w:tc>
+          <w:tcPr>
+            <w:tcW w:w="0" w:type="auto"/>
+            <w:hideMark/>
+          </w:tcPr>
+          <w:p>
+            <w:pPr>
+              <w:jc w:val="center"/>
+              <w:rPr>
+                <w:rFonts w:ascii="Times New Roman" w:hAnsi="Times New Roman" w:cs="Times New Roman"/>
+              </w:rPr>
+            </w:pPr>
+            <w:r>
+              <w:rPr>
+                <w:rFonts w:ascii="Times New Roman" w:hAnsi="Times New Roman" w:cs="Times New Roman"/>
+              </w:rPr>
+              <w:t>notification_type</w:t>
+            </w:r>
+          </w:p>
+        </w:tc>
+        <w:tc>
+          <w:tcPr>
+            <w:tcW w:w="0" w:type="auto"/>
+            <w:hideMark/>
+          </w:tcPr>
+          <w:p>
+            <w:pPr>
+              <w:jc w:val="center"/>
+              <w:rPr>
+                <w:rFonts w:ascii="Times New Roman" w:hAnsi="Times New Roman" w:cs="Times New Roman"/>
+              </w:rPr>
+            </w:pPr>
+            <w:r>
+              <w:rPr>
+                <w:rFonts w:ascii="Times New Roman" w:hAnsi="Times New Roman" w:cs="Times New Roman"/>
+              </w:rPr>
+              <w:t>NOT NULL</w:t>
+            </w:r>
+          </w:p>
+        </w:tc>
+        <w:tc>
+          <w:tcPr>
+            <w:tcW w:w="0" w:type="auto"/>
+            <w:hideMark/>
+          </w:tcPr>
+          <w:p>
+            <w:pPr>
+              <w:jc w:val="center"/>
+              <w:rPr>
+                <w:rFonts w:ascii="Times New Roman" w:hAnsi="Times New Roman" w:cs="Times New Roman"/>
+              </w:rPr>
+            </w:pPr>
+            <w:r>
+              <w:rPr>
+                <w:rFonts w:ascii="Times New Roman" w:hAnsi="Times New Roman" w:cs="Times New Roman"/>
+              </w:rPr>
+              <w:t>—</w:t>
             </w:r>
           </w:p>
         </w:tc>
@@ -7253,67 +7253,67 @@
               <w:rPr>
                 <w:rFonts w:ascii="Times New Roman" w:hAnsi="Times New Roman" w:cs="Times New Roman"/>
               </w:rPr>
-              <w:t xml:space="preserve">to_user_id</w:t>
-            </w:r>
-          </w:p>
-        </w:tc>
-        <w:tc>
-          <w:tcPr>
-            <w:tcW w:w="0" w:type="auto"/>
-            <w:hideMark/>
-          </w:tcPr>
-          <w:p>
-            <w:pPr>
-              <w:jc w:val="center"/>
-              <w:rPr>
-                <w:rFonts w:ascii="Times New Roman" w:hAnsi="Times New Roman" w:cs="Times New Roman"/>
-              </w:rPr>
-            </w:pPr>
-            <w:r>
-              <w:rPr>
-                <w:rFonts w:ascii="Times New Roman" w:hAnsi="Times New Roman" w:cs="Times New Roman"/>
-              </w:rPr>
-              <w:t xml:space="preserve">integer</w:t>
-            </w:r>
-          </w:p>
-        </w:tc>
-        <w:tc>
-          <w:tcPr>
-            <w:tcW w:w="0" w:type="auto"/>
-            <w:hideMark/>
-          </w:tcPr>
-          <w:p>
-            <w:pPr>
-              <w:jc w:val="center"/>
-              <w:rPr>
-                <w:rFonts w:ascii="Times New Roman" w:hAnsi="Times New Roman" w:cs="Times New Roman"/>
-              </w:rPr>
-            </w:pPr>
-            <w:r>
-              <w:rPr>
-                <w:rFonts w:ascii="Times New Roman" w:hAnsi="Times New Roman" w:cs="Times New Roman"/>
-              </w:rPr>
-              <w:t xml:space="preserve">NOT NULL, FK → users.id, INDEX</w:t>
-            </w:r>
-          </w:p>
-        </w:tc>
-        <w:tc>
-          <w:tcPr>
-            <w:tcW w:w="0" w:type="auto"/>
-            <w:hideMark/>
-          </w:tcPr>
-          <w:p>
-            <w:pPr>
-              <w:jc w:val="center"/>
-              <w:rPr>
-                <w:rFonts w:ascii="Times New Roman" w:hAnsi="Times New Roman" w:cs="Times New Roman"/>
-              </w:rPr>
-            </w:pPr>
-            <w:r>
-              <w:rPr>
-                <w:rFonts w:ascii="Times New Roman" w:hAnsi="Times New Roman" w:cs="Times New Roman"/>
-              </w:rPr>
-              <w:t xml:space="preserve">—</w:t>
+              <w:t>to_user_id</w:t>
+            </w:r>
+          </w:p>
+        </w:tc>
+        <w:tc>
+          <w:tcPr>
+            <w:tcW w:w="0" w:type="auto"/>
+            <w:hideMark/>
+          </w:tcPr>
+          <w:p>
+            <w:pPr>
+              <w:jc w:val="center"/>
+              <w:rPr>
+                <w:rFonts w:ascii="Times New Roman" w:hAnsi="Times New Roman" w:cs="Times New Roman"/>
+              </w:rPr>
+            </w:pPr>
+            <w:r>
+              <w:rPr>
+                <w:rFonts w:ascii="Times New Roman" w:hAnsi="Times New Roman" w:cs="Times New Roman"/>
+              </w:rPr>
+              <w:t>integer</w:t>
+            </w:r>
+          </w:p>
+        </w:tc>
+        <w:tc>
+          <w:tcPr>
+            <w:tcW w:w="0" w:type="auto"/>
+            <w:hideMark/>
+          </w:tcPr>
+          <w:p>
+            <w:pPr>
+              <w:jc w:val="center"/>
+              <w:rPr>
+                <w:rFonts w:ascii="Times New Roman" w:hAnsi="Times New Roman" w:cs="Times New Roman"/>
+              </w:rPr>
+            </w:pPr>
+            <w:r>
+              <w:rPr>
+                <w:rFonts w:ascii="Times New Roman" w:hAnsi="Times New Roman" w:cs="Times New Roman"/>
+              </w:rPr>
+              <w:t>NOT NULL, FK → users.id, INDEX</w:t>
+            </w:r>
+          </w:p>
+        </w:tc>
+        <w:tc>
+          <w:tcPr>
+            <w:tcW w:w="0" w:type="auto"/>
+            <w:hideMark/>
+          </w:tcPr>
+          <w:p>
+            <w:pPr>
+              <w:jc w:val="center"/>
+              <w:rPr>
+                <w:rFonts w:ascii="Times New Roman" w:hAnsi="Times New Roman" w:cs="Times New Roman"/>
+              </w:rPr>
+            </w:pPr>
+            <w:r>
+              <w:rPr>
+                <w:rFonts w:ascii="Times New Roman" w:hAnsi="Times New Roman" w:cs="Times New Roman"/>
+              </w:rPr>
+              <w:t>—</w:t>
             </w:r>
           </w:p>
         </w:tc>
@@ -7335,67 +7335,67 @@
               <w:rPr>
                 <w:rFonts w:ascii="Times New Roman" w:hAnsi="Times New Roman" w:cs="Times New Roman"/>
               </w:rPr>
-              <w:t xml:space="preserve">description</w:t>
-            </w:r>
-          </w:p>
-        </w:tc>
-        <w:tc>
-          <w:tcPr>
-            <w:tcW w:w="0" w:type="auto"/>
-            <w:hideMark/>
-          </w:tcPr>
-          <w:p>
-            <w:pPr>
-              <w:jc w:val="center"/>
-              <w:rPr>
-                <w:rFonts w:ascii="Times New Roman" w:hAnsi="Times New Roman" w:cs="Times New Roman"/>
-              </w:rPr>
-            </w:pPr>
-            <w:r>
-              <w:rPr>
-                <w:rFonts w:ascii="Times New Roman" w:hAnsi="Times New Roman" w:cs="Times New Roman"/>
-              </w:rPr>
-              <w:t xml:space="preserve">varchar</w:t>
-            </w:r>
-          </w:p>
-        </w:tc>
-        <w:tc>
-          <w:tcPr>
-            <w:tcW w:w="0" w:type="auto"/>
-            <w:hideMark/>
-          </w:tcPr>
-          <w:p>
-            <w:pPr>
-              <w:jc w:val="center"/>
-              <w:rPr>
-                <w:rFonts w:ascii="Times New Roman" w:hAnsi="Times New Roman" w:cs="Times New Roman"/>
-              </w:rPr>
-            </w:pPr>
-            <w:r>
-              <w:rPr>
-                <w:rFonts w:ascii="Times New Roman" w:hAnsi="Times New Roman" w:cs="Times New Roman"/>
-              </w:rPr>
-              <w:t xml:space="preserve">NOT NULL</w:t>
-            </w:r>
-          </w:p>
-        </w:tc>
-        <w:tc>
-          <w:tcPr>
-            <w:tcW w:w="0" w:type="auto"/>
-            <w:hideMark/>
-          </w:tcPr>
-          <w:p>
-            <w:pPr>
-              <w:jc w:val="center"/>
-              <w:rPr>
-                <w:rFonts w:ascii="Times New Roman" w:hAnsi="Times New Roman" w:cs="Times New Roman"/>
-              </w:rPr>
-            </w:pPr>
-            <w:r>
-              <w:rPr>
-                <w:rFonts w:ascii="Times New Roman" w:hAnsi="Times New Roman" w:cs="Times New Roman"/>
-              </w:rPr>
-              <w:t xml:space="preserve">—</w:t>
+              <w:t>description</w:t>
+            </w:r>
+          </w:p>
+        </w:tc>
+        <w:tc>
+          <w:tcPr>
+            <w:tcW w:w="0" w:type="auto"/>
+            <w:hideMark/>
+          </w:tcPr>
+          <w:p>
+            <w:pPr>
+              <w:jc w:val="center"/>
+              <w:rPr>
+                <w:rFonts w:ascii="Times New Roman" w:hAnsi="Times New Roman" w:cs="Times New Roman"/>
+              </w:rPr>
+            </w:pPr>
+            <w:r>
+              <w:rPr>
+                <w:rFonts w:ascii="Times New Roman" w:hAnsi="Times New Roman" w:cs="Times New Roman"/>
+              </w:rPr>
+              <w:t>varchar</w:t>
+            </w:r>
+          </w:p>
+        </w:tc>
+        <w:tc>
+          <w:tcPr>
+            <w:tcW w:w="0" w:type="auto"/>
+            <w:hideMark/>
+          </w:tcPr>
+          <w:p>
+            <w:pPr>
+              <w:jc w:val="center"/>
+              <w:rPr>
+                <w:rFonts w:ascii="Times New Roman" w:hAnsi="Times New Roman" w:cs="Times New Roman"/>
+              </w:rPr>
+            </w:pPr>
+            <w:r>
+              <w:rPr>
+                <w:rFonts w:ascii="Times New Roman" w:hAnsi="Times New Roman" w:cs="Times New Roman"/>
+              </w:rPr>
+              <w:t>NOT NULL</w:t>
+            </w:r>
+          </w:p>
+        </w:tc>
+        <w:tc>
+          <w:tcPr>
+            <w:tcW w:w="0" w:type="auto"/>
+            <w:hideMark/>
+          </w:tcPr>
+          <w:p>
+            <w:pPr>
+              <w:jc w:val="center"/>
+              <w:rPr>
+                <w:rFonts w:ascii="Times New Roman" w:hAnsi="Times New Roman" w:cs="Times New Roman"/>
+              </w:rPr>
+            </w:pPr>
+            <w:r>
+              <w:rPr>
+                <w:rFonts w:ascii="Times New Roman" w:hAnsi="Times New Roman" w:cs="Times New Roman"/>
+              </w:rPr>
+              <w:t>—</w:t>
             </w:r>
           </w:p>
         </w:tc>
@@ -7417,67 +7417,67 @@
               <w:rPr>
                 <w:rFonts w:ascii="Times New Roman" w:hAnsi="Times New Roman" w:cs="Times New Roman"/>
               </w:rPr>
-              <w:t xml:space="preserve">is_read</w:t>
-            </w:r>
-          </w:p>
-        </w:tc>
-        <w:tc>
-          <w:tcPr>
-            <w:tcW w:w="0" w:type="auto"/>
-            <w:hideMark/>
-          </w:tcPr>
-          <w:p>
-            <w:pPr>
-              <w:jc w:val="center"/>
-              <w:rPr>
-                <w:rFonts w:ascii="Times New Roman" w:hAnsi="Times New Roman" w:cs="Times New Roman"/>
-              </w:rPr>
-            </w:pPr>
-            <w:r>
-              <w:rPr>
-                <w:rFonts w:ascii="Times New Roman" w:hAnsi="Times New Roman" w:cs="Times New Roman"/>
-              </w:rPr>
-              <w:t xml:space="preserve">boolean</w:t>
-            </w:r>
-          </w:p>
-        </w:tc>
-        <w:tc>
-          <w:tcPr>
-            <w:tcW w:w="0" w:type="auto"/>
-            <w:hideMark/>
-          </w:tcPr>
-          <w:p>
-            <w:pPr>
-              <w:jc w:val="center"/>
-              <w:rPr>
-                <w:rFonts w:ascii="Times New Roman" w:hAnsi="Times New Roman" w:cs="Times New Roman"/>
-              </w:rPr>
-            </w:pPr>
-            <w:r>
-              <w:rPr>
-                <w:rFonts w:ascii="Times New Roman" w:hAnsi="Times New Roman" w:cs="Times New Roman"/>
-              </w:rPr>
-              <w:t xml:space="preserve">NOT NULL</w:t>
-            </w:r>
-          </w:p>
-        </w:tc>
-        <w:tc>
-          <w:tcPr>
-            <w:tcW w:w="0" w:type="auto"/>
-            <w:hideMark/>
-          </w:tcPr>
-          <w:p>
-            <w:pPr>
-              <w:jc w:val="center"/>
-              <w:rPr>
-                <w:rFonts w:ascii="Times New Roman" w:hAnsi="Times New Roman" w:cs="Times New Roman"/>
-              </w:rPr>
-            </w:pPr>
-            <w:r>
-              <w:rPr>
-                <w:rFonts w:ascii="Times New Roman" w:hAnsi="Times New Roman" w:cs="Times New Roman"/>
-              </w:rPr>
-              <w:t xml:space="preserve">FALSE</w:t>
+              <w:t>is_read</w:t>
+            </w:r>
+          </w:p>
+        </w:tc>
+        <w:tc>
+          <w:tcPr>
+            <w:tcW w:w="0" w:type="auto"/>
+            <w:hideMark/>
+          </w:tcPr>
+          <w:p>
+            <w:pPr>
+              <w:jc w:val="center"/>
+              <w:rPr>
+                <w:rFonts w:ascii="Times New Roman" w:hAnsi="Times New Roman" w:cs="Times New Roman"/>
+              </w:rPr>
+            </w:pPr>
+            <w:r>
+              <w:rPr>
+                <w:rFonts w:ascii="Times New Roman" w:hAnsi="Times New Roman" w:cs="Times New Roman"/>
+              </w:rPr>
+              <w:t>boolean</w:t>
+            </w:r>
+          </w:p>
+        </w:tc>
+        <w:tc>
+          <w:tcPr>
+            <w:tcW w:w="0" w:type="auto"/>
+            <w:hideMark/>
+          </w:tcPr>
+          <w:p>
+            <w:pPr>
+              <w:jc w:val="center"/>
+              <w:rPr>
+                <w:rFonts w:ascii="Times New Roman" w:hAnsi="Times New Roman" w:cs="Times New Roman"/>
+              </w:rPr>
+            </w:pPr>
+            <w:r>
+              <w:rPr>
+                <w:rFonts w:ascii="Times New Roman" w:hAnsi="Times New Roman" w:cs="Times New Roman"/>
+              </w:rPr>
+              <w:t>NOT NULL</w:t>
+            </w:r>
+          </w:p>
+        </w:tc>
+        <w:tc>
+          <w:tcPr>
+            <w:tcW w:w="0" w:type="auto"/>
+            <w:hideMark/>
+          </w:tcPr>
+          <w:p>
+            <w:pPr>
+              <w:jc w:val="center"/>
+              <w:rPr>
+                <w:rFonts w:ascii="Times New Roman" w:hAnsi="Times New Roman" w:cs="Times New Roman"/>
+              </w:rPr>
+            </w:pPr>
+            <w:r>
+              <w:rPr>
+                <w:rFonts w:ascii="Times New Roman" w:hAnsi="Times New Roman" w:cs="Times New Roman"/>
+              </w:rPr>
+              <w:t>FALSE</w:t>
             </w:r>
           </w:p>
         </w:tc>
@@ -7499,67 +7499,67 @@
               <w:rPr>
                 <w:rFonts w:ascii="Times New Roman" w:hAnsi="Times New Roman" w:cs="Times New Roman"/>
               </w:rPr>
-              <w:t xml:space="preserve">contract_id</w:t>
-            </w:r>
-          </w:p>
-        </w:tc>
-        <w:tc>
-          <w:tcPr>
-            <w:tcW w:w="0" w:type="auto"/>
-            <w:hideMark/>
-          </w:tcPr>
-          <w:p>
-            <w:pPr>
-              <w:jc w:val="center"/>
-              <w:rPr>
-                <w:rFonts w:ascii="Times New Roman" w:hAnsi="Times New Roman" w:cs="Times New Roman"/>
-              </w:rPr>
-            </w:pPr>
-            <w:r>
-              <w:rPr>
-                <w:rFonts w:ascii="Times New Roman" w:hAnsi="Times New Roman" w:cs="Times New Roman"/>
-              </w:rPr>
-              <w:t xml:space="preserve">integer</w:t>
-            </w:r>
-          </w:p>
-        </w:tc>
-        <w:tc>
-          <w:tcPr>
-            <w:tcW w:w="0" w:type="auto"/>
-            <w:hideMark/>
-          </w:tcPr>
-          <w:p>
-            <w:pPr>
-              <w:jc w:val="center"/>
-              <w:rPr>
-                <w:rFonts w:ascii="Times New Roman" w:hAnsi="Times New Roman" w:cs="Times New Roman"/>
-              </w:rPr>
-            </w:pPr>
-            <w:r>
-              <w:rPr>
-                <w:rFonts w:ascii="Times New Roman" w:hAnsi="Times New Roman" w:cs="Times New Roman"/>
-              </w:rPr>
-              <w:t xml:space="preserve">NULLABLE, FK → contracts.id, INDEX</w:t>
-            </w:r>
-          </w:p>
-        </w:tc>
-        <w:tc>
-          <w:tcPr>
-            <w:tcW w:w="0" w:type="auto"/>
-            <w:hideMark/>
-          </w:tcPr>
-          <w:p>
-            <w:pPr>
-              <w:jc w:val="center"/>
-              <w:rPr>
-                <w:rFonts w:ascii="Times New Roman" w:hAnsi="Times New Roman" w:cs="Times New Roman"/>
-              </w:rPr>
-            </w:pPr>
-            <w:r>
-              <w:rPr>
-                <w:rFonts w:ascii="Times New Roman" w:hAnsi="Times New Roman" w:cs="Times New Roman"/>
-              </w:rPr>
-              <w:t xml:space="preserve">—</w:t>
+              <w:t>contract_id</w:t>
+            </w:r>
+          </w:p>
+        </w:tc>
+        <w:tc>
+          <w:tcPr>
+            <w:tcW w:w="0" w:type="auto"/>
+            <w:hideMark/>
+          </w:tcPr>
+          <w:p>
+            <w:pPr>
+              <w:jc w:val="center"/>
+              <w:rPr>
+                <w:rFonts w:ascii="Times New Roman" w:hAnsi="Times New Roman" w:cs="Times New Roman"/>
+              </w:rPr>
+            </w:pPr>
+            <w:r>
+              <w:rPr>
+                <w:rFonts w:ascii="Times New Roman" w:hAnsi="Times New Roman" w:cs="Times New Roman"/>
+              </w:rPr>
+              <w:t>integer</w:t>
+            </w:r>
+          </w:p>
+        </w:tc>
+        <w:tc>
+          <w:tcPr>
+            <w:tcW w:w="0" w:type="auto"/>
+            <w:hideMark/>
+          </w:tcPr>
+          <w:p>
+            <w:pPr>
+              <w:jc w:val="center"/>
+              <w:rPr>
+                <w:rFonts w:ascii="Times New Roman" w:hAnsi="Times New Roman" w:cs="Times New Roman"/>
+              </w:rPr>
+            </w:pPr>
+            <w:r>
+              <w:rPr>
+                <w:rFonts w:ascii="Times New Roman" w:hAnsi="Times New Roman" w:cs="Times New Roman"/>
+              </w:rPr>
+              <w:t>NULLABLE, FK → contracts.id, INDEX</w:t>
+            </w:r>
+          </w:p>
+        </w:tc>
+        <w:tc>
+          <w:tcPr>
+            <w:tcW w:w="0" w:type="auto"/>
+            <w:hideMark/>
+          </w:tcPr>
+          <w:p>
+            <w:pPr>
+              <w:jc w:val="center"/>
+              <w:rPr>
+                <w:rFonts w:ascii="Times New Roman" w:hAnsi="Times New Roman" w:cs="Times New Roman"/>
+              </w:rPr>
+            </w:pPr>
+            <w:r>
+              <w:rPr>
+                <w:rFonts w:ascii="Times New Roman" w:hAnsi="Times New Roman" w:cs="Times New Roman"/>
+              </w:rPr>
+              <w:t>—</w:t>
             </w:r>
           </w:p>
         </w:tc>
@@ -7581,67 +7581,67 @@
               <w:rPr>
                 <w:rFonts w:ascii="Times New Roman" w:hAnsi="Times New Roman" w:cs="Times New Roman"/>
               </w:rPr>
-              <w:t xml:space="preserve">project_id</w:t>
-            </w:r>
-          </w:p>
-        </w:tc>
-        <w:tc>
-          <w:tcPr>
-            <w:tcW w:w="0" w:type="auto"/>
-            <w:hideMark/>
-          </w:tcPr>
-          <w:p>
-            <w:pPr>
-              <w:jc w:val="center"/>
-              <w:rPr>
-                <w:rFonts w:ascii="Times New Roman" w:hAnsi="Times New Roman" w:cs="Times New Roman"/>
-              </w:rPr>
-            </w:pPr>
-            <w:r>
-              <w:rPr>
-                <w:rFonts w:ascii="Times New Roman" w:hAnsi="Times New Roman" w:cs="Times New Roman"/>
-              </w:rPr>
-              <w:t xml:space="preserve">integer</w:t>
-            </w:r>
-          </w:p>
-        </w:tc>
-        <w:tc>
-          <w:tcPr>
-            <w:tcW w:w="0" w:type="auto"/>
-            <w:hideMark/>
-          </w:tcPr>
-          <w:p>
-            <w:pPr>
-              <w:jc w:val="center"/>
-              <w:rPr>
-                <w:rFonts w:ascii="Times New Roman" w:hAnsi="Times New Roman" w:cs="Times New Roman"/>
-              </w:rPr>
-            </w:pPr>
-            <w:r>
-              <w:rPr>
-                <w:rFonts w:ascii="Times New Roman" w:hAnsi="Times New Roman" w:cs="Times New Roman"/>
-              </w:rPr>
-              <w:t xml:space="preserve">NULLABLE, FK → projects.id, INDEX</w:t>
-            </w:r>
-          </w:p>
-        </w:tc>
-        <w:tc>
-          <w:tcPr>
-            <w:tcW w:w="0" w:type="auto"/>
-            <w:hideMark/>
-          </w:tcPr>
-          <w:p>
-            <w:pPr>
-              <w:jc w:val="center"/>
-              <w:rPr>
-                <w:rFonts w:ascii="Times New Roman" w:hAnsi="Times New Roman" w:cs="Times New Roman"/>
-              </w:rPr>
-            </w:pPr>
-            <w:r>
-              <w:rPr>
-                <w:rFonts w:ascii="Times New Roman" w:hAnsi="Times New Roman" w:cs="Times New Roman"/>
-              </w:rPr>
-              <w:t xml:space="preserve">—</w:t>
+              <w:t>project_id</w:t>
+            </w:r>
+          </w:p>
+        </w:tc>
+        <w:tc>
+          <w:tcPr>
+            <w:tcW w:w="0" w:type="auto"/>
+            <w:hideMark/>
+          </w:tcPr>
+          <w:p>
+            <w:pPr>
+              <w:jc w:val="center"/>
+              <w:rPr>
+                <w:rFonts w:ascii="Times New Roman" w:hAnsi="Times New Roman" w:cs="Times New Roman"/>
+              </w:rPr>
+            </w:pPr>
+            <w:r>
+              <w:rPr>
+                <w:rFonts w:ascii="Times New Roman" w:hAnsi="Times New Roman" w:cs="Times New Roman"/>
+              </w:rPr>
+              <w:t>integer</w:t>
+            </w:r>
+          </w:p>
+        </w:tc>
+        <w:tc>
+          <w:tcPr>
+            <w:tcW w:w="0" w:type="auto"/>
+            <w:hideMark/>
+          </w:tcPr>
+          <w:p>
+            <w:pPr>
+              <w:jc w:val="center"/>
+              <w:rPr>
+                <w:rFonts w:ascii="Times New Roman" w:hAnsi="Times New Roman" w:cs="Times New Roman"/>
+              </w:rPr>
+            </w:pPr>
+            <w:r>
+              <w:rPr>
+                <w:rFonts w:ascii="Times New Roman" w:hAnsi="Times New Roman" w:cs="Times New Roman"/>
+              </w:rPr>
+              <w:t>NULLABLE, FK → projects.id, INDEX</w:t>
+            </w:r>
+          </w:p>
+        </w:tc>
+        <w:tc>
+          <w:tcPr>
+            <w:tcW w:w="0" w:type="auto"/>
+            <w:hideMark/>
+          </w:tcPr>
+          <w:p>
+            <w:pPr>
+              <w:jc w:val="center"/>
+              <w:rPr>
+                <w:rFonts w:ascii="Times New Roman" w:hAnsi="Times New Roman" w:cs="Times New Roman"/>
+              </w:rPr>
+            </w:pPr>
+            <w:r>
+              <w:rPr>
+                <w:rFonts w:ascii="Times New Roman" w:hAnsi="Times New Roman" w:cs="Times New Roman"/>
+              </w:rPr>
+              <w:t>—</w:t>
             </w:r>
           </w:p>
         </w:tc>
@@ -7663,67 +7663,67 @@
               <w:rPr>
                 <w:rFonts w:ascii="Times New Roman" w:hAnsi="Times New Roman" w:cs="Times New Roman"/>
               </w:rPr>
-              <w:t xml:space="preserve">from_user_id</w:t>
-            </w:r>
-          </w:p>
-        </w:tc>
-        <w:tc>
-          <w:tcPr>
-            <w:tcW w:w="0" w:type="auto"/>
-            <w:hideMark/>
-          </w:tcPr>
-          <w:p>
-            <w:pPr>
-              <w:jc w:val="center"/>
-              <w:rPr>
-                <w:rFonts w:ascii="Times New Roman" w:hAnsi="Times New Roman" w:cs="Times New Roman"/>
-              </w:rPr>
-            </w:pPr>
-            <w:r>
-              <w:rPr>
-                <w:rFonts w:ascii="Times New Roman" w:hAnsi="Times New Roman" w:cs="Times New Roman"/>
-              </w:rPr>
-              <w:t xml:space="preserve">integer</w:t>
-            </w:r>
-          </w:p>
-        </w:tc>
-        <w:tc>
-          <w:tcPr>
-            <w:tcW w:w="0" w:type="auto"/>
-            <w:hideMark/>
-          </w:tcPr>
-          <w:p>
-            <w:pPr>
-              <w:jc w:val="center"/>
-              <w:rPr>
-                <w:rFonts w:ascii="Times New Roman" w:hAnsi="Times New Roman" w:cs="Times New Roman"/>
-              </w:rPr>
-            </w:pPr>
-            <w:r>
-              <w:rPr>
-                <w:rFonts w:ascii="Times New Roman" w:hAnsi="Times New Roman" w:cs="Times New Roman"/>
-              </w:rPr>
-              <w:t xml:space="preserve">NULLABLE, FK → users.id</w:t>
-            </w:r>
-          </w:p>
-        </w:tc>
-        <w:tc>
-          <w:tcPr>
-            <w:tcW w:w="0" w:type="auto"/>
-            <w:hideMark/>
-          </w:tcPr>
-          <w:p>
-            <w:pPr>
-              <w:jc w:val="center"/>
-              <w:rPr>
-                <w:rFonts w:ascii="Times New Roman" w:hAnsi="Times New Roman" w:cs="Times New Roman"/>
-              </w:rPr>
-            </w:pPr>
-            <w:r>
-              <w:rPr>
-                <w:rFonts w:ascii="Times New Roman" w:hAnsi="Times New Roman" w:cs="Times New Roman"/>
-              </w:rPr>
-              <w:t xml:space="preserve">—</w:t>
+              <w:t>from_user_id</w:t>
+            </w:r>
+          </w:p>
+        </w:tc>
+        <w:tc>
+          <w:tcPr>
+            <w:tcW w:w="0" w:type="auto"/>
+            <w:hideMark/>
+          </w:tcPr>
+          <w:p>
+            <w:pPr>
+              <w:jc w:val="center"/>
+              <w:rPr>
+                <w:rFonts w:ascii="Times New Roman" w:hAnsi="Times New Roman" w:cs="Times New Roman"/>
+              </w:rPr>
+            </w:pPr>
+            <w:r>
+              <w:rPr>
+                <w:rFonts w:ascii="Times New Roman" w:hAnsi="Times New Roman" w:cs="Times New Roman"/>
+              </w:rPr>
+              <w:t>integer</w:t>
+            </w:r>
+          </w:p>
+        </w:tc>
+        <w:tc>
+          <w:tcPr>
+            <w:tcW w:w="0" w:type="auto"/>
+            <w:hideMark/>
+          </w:tcPr>
+          <w:p>
+            <w:pPr>
+              <w:jc w:val="center"/>
+              <w:rPr>
+                <w:rFonts w:ascii="Times New Roman" w:hAnsi="Times New Roman" w:cs="Times New Roman"/>
+              </w:rPr>
+            </w:pPr>
+            <w:r>
+              <w:rPr>
+                <w:rFonts w:ascii="Times New Roman" w:hAnsi="Times New Roman" w:cs="Times New Roman"/>
+              </w:rPr>
+              <w:t>NULLABLE, FK → users.id</w:t>
+            </w:r>
+          </w:p>
+        </w:tc>
+        <w:tc>
+          <w:tcPr>
+            <w:tcW w:w="0" w:type="auto"/>
+            <w:hideMark/>
+          </w:tcPr>
+          <w:p>
+            <w:pPr>
+              <w:jc w:val="center"/>
+              <w:rPr>
+                <w:rFonts w:ascii="Times New Roman" w:hAnsi="Times New Roman" w:cs="Times New Roman"/>
+              </w:rPr>
+            </w:pPr>
+            <w:r>
+              <w:rPr>
+                <w:rFonts w:ascii="Times New Roman" w:hAnsi="Times New Roman" w:cs="Times New Roman"/>
+              </w:rPr>
+              <w:t>—</w:t>
             </w:r>
           </w:p>
         </w:tc>
@@ -7745,67 +7745,67 @@
               <w:rPr>
                 <w:rFonts w:ascii="Times New Roman" w:hAnsi="Times New Roman" w:cs="Times New Roman"/>
               </w:rPr>
-              <w:t xml:space="preserve">created_at</w:t>
-            </w:r>
-          </w:p>
-        </w:tc>
-        <w:tc>
-          <w:tcPr>
-            <w:tcW w:w="0" w:type="auto"/>
-            <w:hideMark/>
-          </w:tcPr>
-          <w:p>
-            <w:pPr>
-              <w:jc w:val="center"/>
-              <w:rPr>
-                <w:rFonts w:ascii="Times New Roman" w:hAnsi="Times New Roman" w:cs="Times New Roman"/>
-              </w:rPr>
-            </w:pPr>
-            <w:r>
-              <w:rPr>
-                <w:rFonts w:ascii="Times New Roman" w:hAnsi="Times New Roman" w:cs="Times New Roman"/>
-              </w:rPr>
-              <w:t xml:space="preserve">timestamptz</w:t>
-            </w:r>
-          </w:p>
-        </w:tc>
-        <w:tc>
-          <w:tcPr>
-            <w:tcW w:w="0" w:type="auto"/>
-            <w:hideMark/>
-          </w:tcPr>
-          <w:p>
-            <w:pPr>
-              <w:jc w:val="center"/>
-              <w:rPr>
-                <w:rFonts w:ascii="Times New Roman" w:hAnsi="Times New Roman" w:cs="Times New Roman"/>
-              </w:rPr>
-            </w:pPr>
-            <w:r>
-              <w:rPr>
-                <w:rFonts w:ascii="Times New Roman" w:hAnsi="Times New Roman" w:cs="Times New Roman"/>
-              </w:rPr>
-              <w:t xml:space="preserve">—</w:t>
-            </w:r>
-          </w:p>
-        </w:tc>
-        <w:tc>
-          <w:tcPr>
-            <w:tcW w:w="0" w:type="auto"/>
-            <w:hideMark/>
-          </w:tcPr>
-          <w:p>
-            <w:pPr>
-              <w:jc w:val="center"/>
-              <w:rPr>
-                <w:rFonts w:ascii="Times New Roman" w:hAnsi="Times New Roman" w:cs="Times New Roman"/>
-              </w:rPr>
-            </w:pPr>
-            <w:r>
-              <w:rPr>
-                <w:rFonts w:ascii="Times New Roman" w:hAnsi="Times New Roman" w:cs="Times New Roman"/>
-              </w:rPr>
-              <w:t xml:space="preserve">CURRENT_TIMESTAMPTZ</w:t>
+              <w:t>created_at</w:t>
+            </w:r>
+          </w:p>
+        </w:tc>
+        <w:tc>
+          <w:tcPr>
+            <w:tcW w:w="0" w:type="auto"/>
+            <w:hideMark/>
+          </w:tcPr>
+          <w:p>
+            <w:pPr>
+              <w:jc w:val="center"/>
+              <w:rPr>
+                <w:rFonts w:ascii="Times New Roman" w:hAnsi="Times New Roman" w:cs="Times New Roman"/>
+              </w:rPr>
+            </w:pPr>
+            <w:r>
+              <w:rPr>
+                <w:rFonts w:ascii="Times New Roman" w:hAnsi="Times New Roman" w:cs="Times New Roman"/>
+              </w:rPr>
+              <w:t>timestamptz</w:t>
+            </w:r>
+          </w:p>
+        </w:tc>
+        <w:tc>
+          <w:tcPr>
+            <w:tcW w:w="0" w:type="auto"/>
+            <w:hideMark/>
+          </w:tcPr>
+          <w:p>
+            <w:pPr>
+              <w:jc w:val="center"/>
+              <w:rPr>
+                <w:rFonts w:ascii="Times New Roman" w:hAnsi="Times New Roman" w:cs="Times New Roman"/>
+              </w:rPr>
+            </w:pPr>
+            <w:r>
+              <w:rPr>
+                <w:rFonts w:ascii="Times New Roman" w:hAnsi="Times New Roman" w:cs="Times New Roman"/>
+              </w:rPr>
+              <w:t>—</w:t>
+            </w:r>
+          </w:p>
+        </w:tc>
+        <w:tc>
+          <w:tcPr>
+            <w:tcW w:w="0" w:type="auto"/>
+            <w:hideMark/>
+          </w:tcPr>
+          <w:p>
+            <w:pPr>
+              <w:jc w:val="center"/>
+              <w:rPr>
+                <w:rFonts w:ascii="Times New Roman" w:hAnsi="Times New Roman" w:cs="Times New Roman"/>
+              </w:rPr>
+            </w:pPr>
+            <w:r>
+              <w:rPr>
+                <w:rFonts w:ascii="Times New Roman" w:hAnsi="Times New Roman" w:cs="Times New Roman"/>
+              </w:rPr>
+              <w:t>CURRENT_TIMESTAMPTZ</w:t>
             </w:r>
           </w:p>
         </w:tc>
@@ -7827,67 +7827,67 @@
               <w:rPr>
                 <w:rFonts w:ascii="Times New Roman" w:hAnsi="Times New Roman" w:cs="Times New Roman"/>
               </w:rPr>
-              <w:t xml:space="preserve">updated_at</w:t>
-            </w:r>
-          </w:p>
-        </w:tc>
-        <w:tc>
-          <w:tcPr>
-            <w:tcW w:w="0" w:type="auto"/>
-            <w:hideMark/>
-          </w:tcPr>
-          <w:p>
-            <w:pPr>
-              <w:jc w:val="center"/>
-              <w:rPr>
-                <w:rFonts w:ascii="Times New Roman" w:hAnsi="Times New Roman" w:cs="Times New Roman"/>
-              </w:rPr>
-            </w:pPr>
-            <w:r>
-              <w:rPr>
-                <w:rFonts w:ascii="Times New Roman" w:hAnsi="Times New Roman" w:cs="Times New Roman"/>
-              </w:rPr>
-              <w:t xml:space="preserve">timestamptz</w:t>
-            </w:r>
-          </w:p>
-        </w:tc>
-        <w:tc>
-          <w:tcPr>
-            <w:tcW w:w="0" w:type="auto"/>
-            <w:hideMark/>
-          </w:tcPr>
-          <w:p>
-            <w:pPr>
-              <w:jc w:val="center"/>
-              <w:rPr>
-                <w:rFonts w:ascii="Times New Roman" w:hAnsi="Times New Roman" w:cs="Times New Roman"/>
-              </w:rPr>
-            </w:pPr>
-            <w:r>
-              <w:rPr>
-                <w:rFonts w:ascii="Times New Roman" w:hAnsi="Times New Roman" w:cs="Times New Roman"/>
-              </w:rPr>
-              <w:t xml:space="preserve">—</w:t>
-            </w:r>
-          </w:p>
-        </w:tc>
-        <w:tc>
-          <w:tcPr>
-            <w:tcW w:w="0" w:type="auto"/>
-            <w:hideMark/>
-          </w:tcPr>
-          <w:p>
-            <w:pPr>
-              <w:jc w:val="center"/>
-              <w:rPr>
-                <w:rFonts w:ascii="Times New Roman" w:hAnsi="Times New Roman" w:cs="Times New Roman"/>
-              </w:rPr>
-            </w:pPr>
-            <w:r>
-              <w:rPr>
-                <w:rFonts w:ascii="Times New Roman" w:hAnsi="Times New Roman" w:cs="Times New Roman"/>
-              </w:rPr>
-              <w:t xml:space="preserve">CURRENT_TIMESTAMPTZ</w:t>
+              <w:t>updated_at</w:t>
+            </w:r>
+          </w:p>
+        </w:tc>
+        <w:tc>
+          <w:tcPr>
+            <w:tcW w:w="0" w:type="auto"/>
+            <w:hideMark/>
+          </w:tcPr>
+          <w:p>
+            <w:pPr>
+              <w:jc w:val="center"/>
+              <w:rPr>
+                <w:rFonts w:ascii="Times New Roman" w:hAnsi="Times New Roman" w:cs="Times New Roman"/>
+              </w:rPr>
+            </w:pPr>
+            <w:r>
+              <w:rPr>
+                <w:rFonts w:ascii="Times New Roman" w:hAnsi="Times New Roman" w:cs="Times New Roman"/>
+              </w:rPr>
+              <w:t>timestamptz</w:t>
+            </w:r>
+          </w:p>
+        </w:tc>
+        <w:tc>
+          <w:tcPr>
+            <w:tcW w:w="0" w:type="auto"/>
+            <w:hideMark/>
+          </w:tcPr>
+          <w:p>
+            <w:pPr>
+              <w:jc w:val="center"/>
+              <w:rPr>
+                <w:rFonts w:ascii="Times New Roman" w:hAnsi="Times New Roman" w:cs="Times New Roman"/>
+              </w:rPr>
+            </w:pPr>
+            <w:r>
+              <w:rPr>
+                <w:rFonts w:ascii="Times New Roman" w:hAnsi="Times New Roman" w:cs="Times New Roman"/>
+              </w:rPr>
+              <w:t>—</w:t>
+            </w:r>
+          </w:p>
+        </w:tc>
+        <w:tc>
+          <w:tcPr>
+            <w:tcW w:w="0" w:type="auto"/>
+            <w:hideMark/>
+          </w:tcPr>
+          <w:p>
+            <w:pPr>
+              <w:jc w:val="center"/>
+              <w:rPr>
+                <w:rFonts w:ascii="Times New Roman" w:hAnsi="Times New Roman" w:cs="Times New Roman"/>
+              </w:rPr>
+            </w:pPr>
+            <w:r>
+              <w:rPr>
+                <w:rFonts w:ascii="Times New Roman" w:hAnsi="Times New Roman" w:cs="Times New Roman"/>
+              </w:rPr>
+              <w:t>CURRENT_TIMESTAMPTZ</w:t>
             </w:r>
           </w:p>
         </w:tc>
@@ -7901,14 +7901,6 @@
           <w:rFonts w:ascii="Times New Roman" w:hAnsi="Times New Roman" w:cs="Times New Roman"/>
         </w:rPr>
       </w:pPr>
-      <w:r>
-        <w:rPr>
-          <w:rFonts w:ascii="Times New Roman" w:hAnsi="Times New Roman" w:cs="Times New Roman"/>
-        </w:rPr>
-        <w:pict w14:anchorId="1A8A75F2">
-          <v:rect id="_x0000_i1031" style="width:0;height:1.5pt" o:hralign="center" o:hrstd="t" o:hr="t" fillcolor="#a0a0a0" stroked="f"/>
-        </w:pict>
-      </w:r>
     </w:p>
     <w:p>
       <w:pPr>
@@ -8021,7 +8013,7 @@
           <w:sz w:val="28"/>
           <w:szCs w:val="28"/>
         </w:rPr>
-        <w:t xml:space="preserve">Таблица 9. Связи между сущностями</w:t>
+        <w:t>Таблица 9. Связи между сущностями</w:t>
       </w:r>
     </w:p>
     <w:tbl>
@@ -8031,9 +8023,9 @@
         <w:tblLook w:val="04A0" w:firstRow="1" w:lastRow="0" w:firstColumn="1" w:lastColumn="0" w:noHBand="0" w:noVBand="1"/>
       </w:tblPr>
       <w:tblGrid>
-        <w:gridCol w:w="3878"/>
-        <w:gridCol w:w="1037"/>
-        <w:gridCol w:w="4430"/>
+        <w:gridCol w:w="3895"/>
+        <w:gridCol w:w="972"/>
+        <w:gridCol w:w="4478"/>
       </w:tblGrid>
       <w:tr>
         <w:tc>
@@ -8548,7 +8540,6 @@
               <w:rPr>
                 <w:rFonts w:ascii="Times New Roman" w:hAnsi="Times New Roman" w:cs="Times New Roman"/>
               </w:rPr>
-              <w:lastRenderedPageBreak/>
               <w:t>Пользователь — Контракт (исполнитель)</w:t>
             </w:r>
           </w:p>
@@ -8983,47 +8974,47 @@
               <w:rPr>
                 <w:rFonts w:ascii="Times New Roman" w:hAnsi="Times New Roman" w:cs="Times New Roman"/>
               </w:rPr>
-              <w:t xml:space="preserve">Пользователь — Уведомление (получатель)</w:t>
-            </w:r>
-          </w:p>
-        </w:tc>
-        <w:tc>
-          <w:tcPr>
-            <w:tcW w:w="0" w:type="auto"/>
-            <w:hideMark/>
-          </w:tcPr>
-          <w:p>
-            <w:pPr>
-              <w:jc w:val="center"/>
-              <w:rPr>
-                <w:rFonts w:ascii="Times New Roman" w:hAnsi="Times New Roman" w:cs="Times New Roman"/>
-              </w:rPr>
-            </w:pPr>
-            <w:r>
-              <w:rPr>
-                <w:rFonts w:ascii="Times New Roman" w:hAnsi="Times New Roman" w:cs="Times New Roman"/>
-              </w:rPr>
-              <w:t xml:space="preserve">1:M</w:t>
-            </w:r>
-          </w:p>
-        </w:tc>
-        <w:tc>
-          <w:tcPr>
-            <w:tcW w:w="0" w:type="auto"/>
-            <w:hideMark/>
-          </w:tcPr>
-          <w:p>
-            <w:pPr>
-              <w:jc w:val="center"/>
-              <w:rPr>
-                <w:rFonts w:ascii="Times New Roman" w:hAnsi="Times New Roman" w:cs="Times New Roman"/>
-              </w:rPr>
-            </w:pPr>
-            <w:r>
-              <w:rPr>
-                <w:rFonts w:ascii="Times New Roman" w:hAnsi="Times New Roman" w:cs="Times New Roman"/>
-              </w:rPr>
-              <w:t xml:space="preserve">Один пользователь может получить много уведомлений</w:t>
+              <w:t>Пользователь — Уведомление (получатель)</w:t>
+            </w:r>
+          </w:p>
+        </w:tc>
+        <w:tc>
+          <w:tcPr>
+            <w:tcW w:w="0" w:type="auto"/>
+            <w:hideMark/>
+          </w:tcPr>
+          <w:p>
+            <w:pPr>
+              <w:jc w:val="center"/>
+              <w:rPr>
+                <w:rFonts w:ascii="Times New Roman" w:hAnsi="Times New Roman" w:cs="Times New Roman"/>
+              </w:rPr>
+            </w:pPr>
+            <w:r>
+              <w:rPr>
+                <w:rFonts w:ascii="Times New Roman" w:hAnsi="Times New Roman" w:cs="Times New Roman"/>
+              </w:rPr>
+              <w:t>1:M</w:t>
+            </w:r>
+          </w:p>
+        </w:tc>
+        <w:tc>
+          <w:tcPr>
+            <w:tcW w:w="0" w:type="auto"/>
+            <w:hideMark/>
+          </w:tcPr>
+          <w:p>
+            <w:pPr>
+              <w:jc w:val="center"/>
+              <w:rPr>
+                <w:rFonts w:ascii="Times New Roman" w:hAnsi="Times New Roman" w:cs="Times New Roman"/>
+              </w:rPr>
+            </w:pPr>
+            <w:r>
+              <w:rPr>
+                <w:rFonts w:ascii="Times New Roman" w:hAnsi="Times New Roman" w:cs="Times New Roman"/>
+              </w:rPr>
+              <w:t>Один пользователь может получить много уведомлений</w:t>
             </w:r>
           </w:p>
         </w:tc>
@@ -9045,47 +9036,47 @@
               <w:rPr>
                 <w:rFonts w:ascii="Times New Roman" w:hAnsi="Times New Roman" w:cs="Times New Roman"/>
               </w:rPr>
-              <w:t xml:space="preserve">Пользователь — Уведомление (инициатор)</w:t>
-            </w:r>
-          </w:p>
-        </w:tc>
-        <w:tc>
-          <w:tcPr>
-            <w:tcW w:w="0" w:type="auto"/>
-            <w:hideMark/>
-          </w:tcPr>
-          <w:p>
-            <w:pPr>
-              <w:jc w:val="center"/>
-              <w:rPr>
-                <w:rFonts w:ascii="Times New Roman" w:hAnsi="Times New Roman" w:cs="Times New Roman"/>
-              </w:rPr>
-            </w:pPr>
-            <w:r>
-              <w:rPr>
-                <w:rFonts w:ascii="Times New Roman" w:hAnsi="Times New Roman" w:cs="Times New Roman"/>
-              </w:rPr>
-              <w:t xml:space="preserve">1:M</w:t>
-            </w:r>
-          </w:p>
-        </w:tc>
-        <w:tc>
-          <w:tcPr>
-            <w:tcW w:w="0" w:type="auto"/>
-            <w:hideMark/>
-          </w:tcPr>
-          <w:p>
-            <w:pPr>
-              <w:jc w:val="center"/>
-              <w:rPr>
-                <w:rFonts w:ascii="Times New Roman" w:hAnsi="Times New Roman" w:cs="Times New Roman"/>
-              </w:rPr>
-            </w:pPr>
-            <w:r>
-              <w:rPr>
-                <w:rFonts w:ascii="Times New Roman" w:hAnsi="Times New Roman" w:cs="Times New Roman"/>
-              </w:rPr>
-              <w:t xml:space="preserve">Один пользователь может быть инициатором многих уведомлений</w:t>
+              <w:t>Пользователь — Уведомление (инициатор)</w:t>
+            </w:r>
+          </w:p>
+        </w:tc>
+        <w:tc>
+          <w:tcPr>
+            <w:tcW w:w="0" w:type="auto"/>
+            <w:hideMark/>
+          </w:tcPr>
+          <w:p>
+            <w:pPr>
+              <w:jc w:val="center"/>
+              <w:rPr>
+                <w:rFonts w:ascii="Times New Roman" w:hAnsi="Times New Roman" w:cs="Times New Roman"/>
+              </w:rPr>
+            </w:pPr>
+            <w:r>
+              <w:rPr>
+                <w:rFonts w:ascii="Times New Roman" w:hAnsi="Times New Roman" w:cs="Times New Roman"/>
+              </w:rPr>
+              <w:t>1:M</w:t>
+            </w:r>
+          </w:p>
+        </w:tc>
+        <w:tc>
+          <w:tcPr>
+            <w:tcW w:w="0" w:type="auto"/>
+            <w:hideMark/>
+          </w:tcPr>
+          <w:p>
+            <w:pPr>
+              <w:jc w:val="center"/>
+              <w:rPr>
+                <w:rFonts w:ascii="Times New Roman" w:hAnsi="Times New Roman" w:cs="Times New Roman"/>
+              </w:rPr>
+            </w:pPr>
+            <w:r>
+              <w:rPr>
+                <w:rFonts w:ascii="Times New Roman" w:hAnsi="Times New Roman" w:cs="Times New Roman"/>
+              </w:rPr>
+              <w:t>Один пользователь может быть инициатором многих уведомлений</w:t>
             </w:r>
           </w:p>
         </w:tc>
@@ -9107,47 +9098,47 @@
               <w:rPr>
                 <w:rFonts w:ascii="Times New Roman" w:hAnsi="Times New Roman" w:cs="Times New Roman"/>
               </w:rPr>
-              <w:t xml:space="preserve">Контракт — Уведомление</w:t>
-            </w:r>
-          </w:p>
-        </w:tc>
-        <w:tc>
-          <w:tcPr>
-            <w:tcW w:w="0" w:type="auto"/>
-            <w:hideMark/>
-          </w:tcPr>
-          <w:p>
-            <w:pPr>
-              <w:jc w:val="center"/>
-              <w:rPr>
-                <w:rFonts w:ascii="Times New Roman" w:hAnsi="Times New Roman" w:cs="Times New Roman"/>
-              </w:rPr>
-            </w:pPr>
-            <w:r>
-              <w:rPr>
-                <w:rFonts w:ascii="Times New Roman" w:hAnsi="Times New Roman" w:cs="Times New Roman"/>
-              </w:rPr>
-              <w:t xml:space="preserve">1:M</w:t>
-            </w:r>
-          </w:p>
-        </w:tc>
-        <w:tc>
-          <w:tcPr>
-            <w:tcW w:w="0" w:type="auto"/>
-            <w:hideMark/>
-          </w:tcPr>
-          <w:p>
-            <w:pPr>
-              <w:jc w:val="center"/>
-              <w:rPr>
-                <w:rFonts w:ascii="Times New Roman" w:hAnsi="Times New Roman" w:cs="Times New Roman"/>
-              </w:rPr>
-            </w:pPr>
-            <w:r>
-              <w:rPr>
-                <w:rFonts w:ascii="Times New Roman" w:hAnsi="Times New Roman" w:cs="Times New Roman"/>
-              </w:rPr>
-              <w:t xml:space="preserve">Одно уведомление может ссылаться на контракт (сообщение, этап, контракт)</w:t>
+              <w:t>Контракт — Уведомление</w:t>
+            </w:r>
+          </w:p>
+        </w:tc>
+        <w:tc>
+          <w:tcPr>
+            <w:tcW w:w="0" w:type="auto"/>
+            <w:hideMark/>
+          </w:tcPr>
+          <w:p>
+            <w:pPr>
+              <w:jc w:val="center"/>
+              <w:rPr>
+                <w:rFonts w:ascii="Times New Roman" w:hAnsi="Times New Roman" w:cs="Times New Roman"/>
+              </w:rPr>
+            </w:pPr>
+            <w:r>
+              <w:rPr>
+                <w:rFonts w:ascii="Times New Roman" w:hAnsi="Times New Roman" w:cs="Times New Roman"/>
+              </w:rPr>
+              <w:t>1:M</w:t>
+            </w:r>
+          </w:p>
+        </w:tc>
+        <w:tc>
+          <w:tcPr>
+            <w:tcW w:w="0" w:type="auto"/>
+            <w:hideMark/>
+          </w:tcPr>
+          <w:p>
+            <w:pPr>
+              <w:jc w:val="center"/>
+              <w:rPr>
+                <w:rFonts w:ascii="Times New Roman" w:hAnsi="Times New Roman" w:cs="Times New Roman"/>
+              </w:rPr>
+            </w:pPr>
+            <w:r>
+              <w:rPr>
+                <w:rFonts w:ascii="Times New Roman" w:hAnsi="Times New Roman" w:cs="Times New Roman"/>
+              </w:rPr>
+              <w:t>Одно уведомление может ссылаться на контракт (сообщение, этап, контракт)</w:t>
             </w:r>
           </w:p>
         </w:tc>
@@ -9169,47 +9160,47 @@
               <w:rPr>
                 <w:rFonts w:ascii="Times New Roman" w:hAnsi="Times New Roman" w:cs="Times New Roman"/>
               </w:rPr>
-              <w:t xml:space="preserve">Проект — Уведомление</w:t>
-            </w:r>
-          </w:p>
-        </w:tc>
-        <w:tc>
-          <w:tcPr>
-            <w:tcW w:w="0" w:type="auto"/>
-            <w:hideMark/>
-          </w:tcPr>
-          <w:p>
-            <w:pPr>
-              <w:jc w:val="center"/>
-              <w:rPr>
-                <w:rFonts w:ascii="Times New Roman" w:hAnsi="Times New Roman" w:cs="Times New Roman"/>
-              </w:rPr>
-            </w:pPr>
-            <w:r>
-              <w:rPr>
-                <w:rFonts w:ascii="Times New Roman" w:hAnsi="Times New Roman" w:cs="Times New Roman"/>
-              </w:rPr>
-              <w:t xml:space="preserve">1:M</w:t>
-            </w:r>
-          </w:p>
-        </w:tc>
-        <w:tc>
-          <w:tcPr>
-            <w:tcW w:w="0" w:type="auto"/>
-            <w:hideMark/>
-          </w:tcPr>
-          <w:p>
-            <w:pPr>
-              <w:jc w:val="center"/>
-              <w:rPr>
-                <w:rFonts w:ascii="Times New Roman" w:hAnsi="Times New Roman" w:cs="Times New Roman"/>
-              </w:rPr>
-            </w:pPr>
-            <w:r>
-              <w:rPr>
-                <w:rFonts w:ascii="Times New Roman" w:hAnsi="Times New Roman" w:cs="Times New Roman"/>
-              </w:rPr>
-              <w:t xml:space="preserve">Одно уведомление может ссылаться на проект (отклик по проекту)</w:t>
+              <w:t>Проект — Уведомление</w:t>
+            </w:r>
+          </w:p>
+        </w:tc>
+        <w:tc>
+          <w:tcPr>
+            <w:tcW w:w="0" w:type="auto"/>
+            <w:hideMark/>
+          </w:tcPr>
+          <w:p>
+            <w:pPr>
+              <w:jc w:val="center"/>
+              <w:rPr>
+                <w:rFonts w:ascii="Times New Roman" w:hAnsi="Times New Roman" w:cs="Times New Roman"/>
+              </w:rPr>
+            </w:pPr>
+            <w:r>
+              <w:rPr>
+                <w:rFonts w:ascii="Times New Roman" w:hAnsi="Times New Roman" w:cs="Times New Roman"/>
+              </w:rPr>
+              <w:t>1:M</w:t>
+            </w:r>
+          </w:p>
+        </w:tc>
+        <w:tc>
+          <w:tcPr>
+            <w:tcW w:w="0" w:type="auto"/>
+            <w:hideMark/>
+          </w:tcPr>
+          <w:p>
+            <w:pPr>
+              <w:jc w:val="center"/>
+              <w:rPr>
+                <w:rFonts w:ascii="Times New Roman" w:hAnsi="Times New Roman" w:cs="Times New Roman"/>
+              </w:rPr>
+            </w:pPr>
+            <w:r>
+              <w:rPr>
+                <w:rFonts w:ascii="Times New Roman" w:hAnsi="Times New Roman" w:cs="Times New Roman"/>
+              </w:rPr>
+              <w:t>Одно уведомление может ссылаться на проект (отклик по проекту)</w:t>
             </w:r>
           </w:p>
         </w:tc>

</xml_diff>